<commit_message>
Duzeltme: Seviye C geri bildirim mesajindaki N yerine gercek basarisiz test sayisi ornegi
</commit_message>
<xml_diff>
--- a/makale_v11.docx
+++ b/makale_v11.docx
@@ -4738,7 +4738,7 @@
           <w:b w:val="0"/>
           <w:i w:val="0"/>
         </w:rPr>
-        <w:t>Bu iddiayı varsayımsal bırakmamak için, veri setinin güncel hâlindeki (57 örnek, Round 1'deki 17 başarısız örneğin tamamı) iki ek geri bildirim seviyesiyle ayrı ayrı iyileştirme denemesi yapılmış ve gerçek derleme/çalıştırma sonuçları ölçülmüştür (kod değişiklikleri değil, yalnızca modele sağlanan bilgi kısıtlanmıştır): Seviye B'de modele yalnızca tam derleyici hatası veya çalışma zamanı panik metni (CE/RE için) ya da başarısız test girdisinin ham içeriği (FE için, beklenen/alınan çıktı farkı gösterilmeden) verilmiş; Seviye C'de ise yalnızca "N test başarısız" biçiminde toplu bir bilgi verilmiş (derleme hatası hariç — bir CI derleme adımı hatasını hiçbir zaman gizleyemeyeceğinden bu istisna tutulmuştur). Tablo 5, üç geri bildirim seviyesinin sonucunu karşılaştırmaktadır.</w:t>
+        <w:t>Bu iddiayı varsayımsal bırakmamak için, veri setinin güncel hâlindeki (57 örnek, Round 1'deki 17 başarısız örneğin tamamı) iki ek geri bildirim seviyesiyle ayrı ayrı iyileştirme denemesi yapılmış ve gerçek derleme/çalıştırma sonuçları ölçülmüştür (kod değişiklikleri değil, yalnızca modele sağlanan bilgi kısıtlanmıştır): Seviye B'de modele yalnızca tam derleyici hatası veya çalışma zamanı panik metni (CE/RE için) ya da başarısız test girdisinin ham içeriği (FE için, beklenen/alınan çıktı farkı gösterilmeden) verilmiş; Seviye C'de ise yalnızca o örneğin gerçek başarısız test sayısı, örn. "3 test başarısız" (s09_djb2_hash için 3/3) veya "1 test başarısız" (s06_reverse_string için 1/4) biçiminde toplu bir sayı verilmiş — hangi girdinin, neden başarısız olduğuna dair hiçbir ayrıntı olmadan (derleme hatası hariç — bir CI derleme adımı hatasını hiçbir zaman gizleyemeyeceğinden bu istisna tutulmuştur). Tablo 5, üç geri bildirim seviyesinin sonucunu karşılaştırmaktadır.</w:t>
       </w:r>
     </w:p>
     <w:p>
@@ -5172,7 +5172,7 @@
                 <w:b w:val="0"/>
                 <w:sz w:val="19"/>
               </w:rPr>
-              <w:t>Yalnızca "N test başarısız" (CE hariç)</w:t>
+              <w:t>Yalnızca gerçek başarısız test sayısı, ör. "3 test başarısız" (CE hariç)</w:t>
             </w:r>
           </w:p>
         </w:tc>

</xml_diff>

<commit_message>
Gemini cevirilerini 22/57'den 44/57'ye tamamla, gercek EA=93.18 (41/44) ile makaleyi guncelle
</commit_message>
<xml_diff>
--- a/makale_v11.docx
+++ b/makale_v11.docx
@@ -5301,7 +5301,7 @@
           <w:b w:val="0"/>
           <w:i w:val="0"/>
         </w:rPr>
-        <w:t>Çoklu model: Model-bağımsız bir çeviri altyapısı (`harness/translators/`) kurularak Google Gemini (`gemini-flash-latest`) ile gerçek, otomatik API çağrılarıyla kısmi bir tekrar ölçüm yapılmıştır. Google AI Studio ücretsiz katmanının kota sınırı (20 istek/gün/model, ancak gözlemlenen davranış katı bir günlük sıfırlamadan çok kısa/kayan bir pencereye benzemektedir) nedeniyle yalnızca 22/57 örnek çevrilebilmiştir; bu kısmi örneklemde Gemini EA = %95.45 (21/22) ölçülmüştür. Tek başarısızlık (s15_float_avg), Claude'da da aynı kök nedenden (çıktı biçimlendirme, §4.4.D) kaynaklanmıştır — bu, ilgili semantik boşluğun en azından bu tek örnekte modele özgü olmayabileceğine dair bir işarettir. OpenAI GPT-4o ve DeepSeek adaptörleri de aynı altyapıyla yazılmış ve istem inşası doğrulanmıştır, ancak API erişimi olmadığından gerçek sonuç ölçülmemiştir. Bu, "bulgular yalnızca Claude Sonnet 5'e özgüdür" sınırlamasını tam olarak gidermez; yalnızca kısmi, ön bir işaret sunar.</w:t>
+        <w:t>Çoklu model: Model-bağımsız bir çeviri altyapısı (`harness/translators/`) kurularak Google Gemini (`gemini-flash-latest`) ile gerçek, otomatik API çağrılarıyla kısmi bir tekrar ölçüm yapılmıştır. Google AI Studio ücretsiz katmanının kota sınırı (istekler arasına 150 saniyeye kadar bekleme konulmasına rağmen aşılan, günlük bir kota gibi görünmektedir) nedeniyle toplam 57 örnekten 44'ü çevrilebilmiştir; bu kısmi örneklemde Gemini EA = %93.18 (41/44) ölçülmüştür. Üç başarısızlıktan biri (s15_float_avg), Claude'da da aynı kök nedenden (çıktı biçimlendirme, §4.4.D) kaynaklanmıştır — bu, ilgili semantik boşluğun en azından bu örnekte modele özgü olmayabileceğine dair bir işarettir. Diğer ikisi Claude'da görülmeyen, Gemini'ye özgü derleme hatalarıdır: s26_rpn_calculator'da aynı kapanışın (closure) içinde bir değişkeni iki farklı `FnMut` kapanışıyla eşzamanlı ödünç almaya çalışması (Rust ödünç denetleyicisi hatası, E0499) ve s27_csv_stats'ta geçersiz bir biçim dizesi söz dizimi (`{:+=03}`) üretilmesi — bu ikisi, farklı modellerin farklı, birbirini örtüşmeyen hata sınıfları üretebileceğini göstermektedir. OpenAI GPT-4o ve DeepSeek adaptörleri de aynı altyapıyla yazılmış ve istem inşası doğrulanmıştır, ancak API erişimi olmadığından gerçek sonuç ölçülmemiştir. Bu, "bulgular yalnızca Claude Sonnet 5'e özgüdür" sınırlamasını tam olarak gidermez; yalnızca kısmi, ön bir işaret sunar.</w:t>
       </w:r>
     </w:p>
     <w:p>
@@ -5457,7 +5457,7 @@
           <w:b w:val="0"/>
           <w:i w:val="0"/>
         </w:rPr>
-        <w:t>Veri seti 57 program ve 229 test girdisiyle sınırlıdır; bu, istatistiksel olarak küçük bir örneklemdir ve gözlenen oranlar (özellikle kod uzunluğu-başarı ilişkisi) büyük, gerçek dünya kod tabanlarına doğrudan genellenemez — kod uzunluğu 522 satıra kadar genişletilmiş olsa da, gerçek eski-kod (legacy) tabanları çoğunlukla binlerce satırlık, çok dosyalı sistemlerdir ve bu ölçekte farklı hata örüntüleri (ör. modüller-arası durum yönetimi, çoklu iş parçacığı) ortaya çıkabilir. Programların 29'u tarafımızca yazılmıştır; 7'si (s30-s36) Rosetta Code'dan alınmış eğitim amaçlı gerçek dünya kodu, 3'ü (s37-s39) OpenBSD/FreeBSD libc'sinden, 3'ü de (s46-s48) musl libc/Redis/cJSON'dan alınmış gerçek üretim (production) kodudur — ancak bu 13 örnek de tek fonksiyonluk (ya da az sayıda ilişkili fonksiyonluk), bağımsız algoritma/kütüphane fonksiyonu örnekleridir ve gerçek eski-kod tabanlarının tüm karmaşıklığını (çoklu dosya, harici bağımlılıklar, eşzamanlılık) yansıtmaz. Çeviriyi yapan tek bir model (Claude Sonnet 5) kullanılmıştır; bulgular yalnızca bu modele özgüdür ve farklı modellerin (GPT, Gemini, DeepSeek, Qwen vb.) hata profilleri niteliksel olarak farklılık gösterebilir — betik model-bağımsız tasarlandığından bu, doğrudan gelecekteki bir tekrar çalışmasıyla test edilebilir; nitekim Google Gemini ile kısmi bir tekrar ölçüm (22/57 örnek, API kotası nedeniyle sınırlı) yapılmış ve %95.45 EA ölçülmüştür — bu, farklı bir modelin de benzer bir kök nedene (çıktı biçimlendirme) düştüğünü göstermiş, ancak kapsamlı bir model karşılaştırması için yeterli değildir. Ayrıca, örneklerin büyük çoğunluğu tek dosyalı olsa da, veri setine 3 çok dosyalı/gerçekçi örnek (paylaşılan başlık dosyası, birden fazla derleme birimi, pthread tabanlı paylaşılan bellek eşzamanlılığı) eklenmiş ve bunların hiçbirinde derleme hatası gözlenmemiştir — bu, gözlenen yüksek derleme başarı oranının (%98.2) çok dosyalı yapıya karşı kısmen dayanıklı olduğuna işaret etse de, yalnızca 3 örnekle sınırlıdır; çok daha derin modül hiyerarşilerine ve build sistemlerine (Makefile/CMake) bağımlı gerçek projelerde derleme hataları yine de daha sık görülebilir. Deney ayrıca gerçek bir Linux/LP64 ortamında (Docker) tekrarlanmış ve Round 2'nin Windows'ta ölçülen %100 EA'sının Linux'ta %94.55'e düştüğü gözlenmiştir — s38 ve s51 için yazılan düzeltmeler (32-bit `long` varsayımı) 64-bit `long`'da geçersiz hale gelmiştir; bu, "iyileştirilmiş" bir çevirinin platforma özgü olabileceğine dair doğrudan kanıttır. Son olarak, s38_bsd_strtol'deki taşma eşiği (ve dolayısıyla o örneğin başarısızlığı), bu derleme ortamının platform-özgü `long` genişliğine (32 bit) bağımlıdır (§3.7); Linux/LP64 gibi 64-bit `long` kullanan bir ortamda aynı test aynı sonucu vermeyebilir — bu, tek bir platformda çalıştırılan deneylerin taşınabilirliğine ilişkin ayrı bir tehdittir.</w:t>
+        <w:t>Veri seti 57 program ve 229 test girdisiyle sınırlıdır; bu, istatistiksel olarak küçük bir örneklemdir ve gözlenen oranlar (özellikle kod uzunluğu-başarı ilişkisi) büyük, gerçek dünya kod tabanlarına doğrudan genellenemez — kod uzunluğu 522 satıra kadar genişletilmiş olsa da, gerçek eski-kod (legacy) tabanları çoğunlukla binlerce satırlık, çok dosyalı sistemlerdir ve bu ölçekte farklı hata örüntüleri (ör. modüller-arası durum yönetimi, çoklu iş parçacığı) ortaya çıkabilir. Programların 29'u tarafımızca yazılmıştır; 7'si (s30-s36) Rosetta Code'dan alınmış eğitim amaçlı gerçek dünya kodu, 3'ü (s37-s39) OpenBSD/FreeBSD libc'sinden, 3'ü de (s46-s48) musl libc/Redis/cJSON'dan alınmış gerçek üretim (production) kodudur — ancak bu 13 örnek de tek fonksiyonluk (ya da az sayıda ilişkili fonksiyonluk), bağımsız algoritma/kütüphane fonksiyonu örnekleridir ve gerçek eski-kod tabanlarının tüm karmaşıklığını (çoklu dosya, harici bağımlılıklar, eşzamanlılık) yansıtmaz. Çeviriyi yapan tek bir model (Claude Sonnet 5) kullanılmıştır; bulgular yalnızca bu modele özgüdür ve farklı modellerin (GPT, Gemini, DeepSeek, Qwen vb.) hata profilleri niteliksel olarak farklılık gösterebilir — betik model-bağımsız tasarlandığından bu, doğrudan gelecekteki bir tekrar çalışmasıyla test edilebilir; nitekim Google Gemini ile kısmi bir tekrar ölçüm (44/57 örnek, API kotası nedeniyle sınırlı) yapılmış ve %93.18 EA (41/44) ölçülmüştür — başarısızlıklardan biri Claude ile aynı kök nedene (çıktı biçimlendirme) düşerken, diğer ikisi Gemini'ye özgü farklı derleme hatalarıdır (bkz. §4.9); bu, farklı modellerin hem ortak hem de birbirinden bağımsız hata sınıfları üretebileceğini göstermiş, ancak kapsamlı bir model karşılaştırması için yeterli değildir. Ayrıca, örneklerin büyük çoğunluğu tek dosyalı olsa da, veri setine 3 çok dosyalı/gerçekçi örnek (paylaşılan başlık dosyası, birden fazla derleme birimi, pthread tabanlı paylaşılan bellek eşzamanlılığı) eklenmiş ve bunların hiçbirinde derleme hatası gözlenmemiştir — bu, gözlenen yüksek derleme başarı oranının (%98.2) çok dosyalı yapıya karşı kısmen dayanıklı olduğuna işaret etse de, yalnızca 3 örnekle sınırlıdır; çok daha derin modül hiyerarşilerine ve build sistemlerine (Makefile/CMake) bağımlı gerçek projelerde derleme hataları yine de daha sık görülebilir. Deney ayrıca gerçek bir Linux/LP64 ortamında (Docker) tekrarlanmış ve Round 2'nin Windows'ta ölçülen %100 EA'sının Linux'ta %94.55'e düştüğü gözlenmiştir — s38 ve s51 için yazılan düzeltmeler (32-bit `long` varsayımı) 64-bit `long`'da geçersiz hale gelmiştir; bu, "iyileştirilmiş" bir çevirinin platforma özgü olabileceğine dair doğrudan kanıttır. Son olarak, s38_bsd_strtol'deki taşma eşiği (ve dolayısıyla o örneğin başarısızlığı), bu derleme ortamının platform-özgü `long` genişliğine (32 bit) bağımlıdır (§3.7); Linux/LP64 gibi 64-bit `long` kullanan bir ortamda aynı test aynı sonucu vermeyebilir — bu, tek bir platformda çalıştırılan deneylerin taşınabilirliğine ilişkin ayrı bir tehdittir.</w:t>
       </w:r>
     </w:p>
     <w:p>

</xml_diff>

<commit_message>
Makaleyi kisalt ve AI-yazim izlerini azalt: Oz, Giris katkilar, Sonuc yeniden yazildi
Oz 4 kisa paragrafa bolundu (~%45 kisaltildi), Sonuc bolumu abstract'i
tekrar etmek yerine sentezleyecek sekilde kisaltildi (~%55 kisaltildi),
"bulgular yalniz bu modele ozgudur" uyarisi 4 yerden 1 tam + pointerlara
indirildi, kod uzunlugu bolumundeki tekrarlayan kapanis cumleleri
budandi. Yontem/Bulgular bolumlerindeki teknik detay (tekrarlanabilirlik
icin hakemler tarafindan talep edilmisti) korundu.
</commit_message>
<xml_diff>
--- a/makale_v11.docx
+++ b/makale_v11.docx
@@ -43,7 +43,34 @@
           <w:b w:val="0"/>
           <w:i w:val="0"/>
         </w:rPr>
-        <w:t>Büyük dil modelleri (LLM), eski (legacy) kod tabanlarının bakımı zorlaşan dillerden bellek güvenli dillere aktarılmasında hızla yaygınlaşan bir araç haline gelmiştir. Ancak bu çevirilerin ne ölçüde davranışsal olarak eşdeğer olduğu, özellikle sözdizimsel olarak doğru göründüğü hâlde çalışma zamanında veya işlevsel olarak sapan çeviriler açısından yeterince incelenmemiştir. Bu çalışmada, 57 C programından oluşan özgün bir kıyaslama (benchmark) seti üzerinde — kod uzunluğunun etkisini güvenilir biçimde test edebilmek için 10 ile 522 satır arasında geniş bir yelpazeyi kapsayacak şekilde genişletilmiş; 7'si Rosetta Code'dan alınmış eğitim amaçlı gerçek dünya algoritması, 3'ü OpenBSD/FreeBSD libc'sinden alınmış gerçek üretim (production) legacy kodu (getopt, strtol, heapsort — 32-39 yıllık, BSD-3-Clause lisanslı), 6'sı daha önce hedeflenmemiş C↔Rust boşluklarını (usize taşması, union bit-örüntüsü, bit-alanları, switch fallthrough, fonksiyon-lokal static, goto temizliği) test eden yeni özgün program ve 3'ü musl libc, Redis ve cJSON gibi yaygın kullanılan gerçek açık kaynak projelerinden alınmış, önceki tüm örneklerden belirgin biçimde daha uzun/karmaşık kod (262-522 satır, MIT/BSD-3-Clause) içeren — Claude tarafından üretilen zero-shot C→Rust çevirilerinin yürütme doğruluğu (Execution Accuracy, EA), diferansiyel test yoluyla ölçülmüştür. Ham çeviriler, referans C programlarıyla aynı 226 test girdisinde çalıştırılmış ve çıktılar karşılaştırılmıştır. Sonuçlar, ham çeviri doğruluğunun yalnızca %70.18 olduğunu göstermektedir; başarısızlıkların onu sorunsuz derlenmiş ve yalnızca çalışma zamanında veya çıktı karşılaştırmasında ortaya çıkmıştır. Kök neden analizi, hataların dört ayrı taksonomi türüne (derleme, çalışma zamanı, işlevsel, sonlanmama) ve dokuz tekrar eden semantik boşluğa (unsigned tamsayı taşması, bayt/karakter string modeli, char işaretliliği, çıktı biçimlendirme semantiği, güvenli olmayan global durum, platforma bağlı tamsayı genişliğinin sabit varsayılması, usize altında işaretsiz taşma, switch/case fallthrough'ın kaybolması ve C makrolarının çoklu-değerlendirme yan etkisi) dayandığını ortaya koymuştur — bu kategorilerin dördü, veri seti kademeli olarak genişletildikçe ortaya çıkan, başlangıçta öngörülmemiş bulgulardır. Deney ayrıca üç ek boyutta genişletilmiştir: (i) ikinci bir modelle (Google Gemini) kısmi ama gerçek bir tekrar ölçüm, (ii) çok dosyalı/gerçekçi C yapıları (paylaşılan başlık dosyası, birden fazla derleme birimi, pthread tabanlı paylaşılan bellek eşzamanlılığı) ve (iii) gerçek bir Linux/LP64 (64-bit `long`) ortamında (Docker) tam tekrarlama. Üçüncü boyut, çalışmanın en önemli ek bulgusunu üretmiştir: Round 2'nin Windows'ta ölçülen %100 doğruluğu, platforma özgü iki düzeltme nedeniyle Linux'ta %94.55'e düşmüştür — yani bir platformda doğrulanmış bir düzeltme başka bir platformda geçersiz olabilir. Gerçek dünyadan alınan 13 bağımsız algoritmanın (Rosetta Code + BSD libc + musl/Redis/cJSON) 11'i ilk seferde geçmiştir; iki başarısızlıktan biri (strtol çevirisi) platform-bağımlı tamsayı genişliği boşluğundan, diğeri (cJSON sayı yazdırma çevirisi) çıktı biçimlendirme semantiğinden kaynaklanmıştır — ikisi de kod uzunluğuyla değil belirli semantik boşluklarla ilişkilidir; nitekim veri setindeki en uzun program (522 satır, Redis'in dinamik string kütüphanesi) ilk seferde sorunsuz geçmiştir. Bu, başarı/başarısızlığın kod uzunluğundan çok belirli semantik boşluklarla ilişkili olduğu bulgusunu güçlü biçimde desteklemektedir. Aynı ham çevirilerin Rust release modunda (taşma kontrolü kapalı) derlenmesiyle EA'nın %73.68'e yükseldiği, ancak bunun bir iyileşme değil hatanın maskelenmesi olduğu — ve yalnızca aritmetik taşma kaynaklı çökmeleri etkilediği, dizi sınır aşımı kaynaklı yeni bir çökme türünü etkilemediği — gösterilmiştir. Bellek güvenliği analizi, 114 çeviri dosyasının (57 örnek × 2 tur) yalnızca altısında (getopt, fonksiyon-lokal static önbellekleme ve musl'un bit-düzeyi smoothsort çevirileri, üçü de gerçek kodun dışa açık/kalıcı durum ya da ham byte-pointer aritmetiği sözleşmesini yansıtan) `unsafe` kullanıldığını; buna karşılık ham işaretçi aritmetiğine yapısal olarak bağımlı iki başka gerçek örneğin (heapsort ve özellikle Redis'in gizli pointer-öncesi başlık düzenini kullanan string kütüphanesi) modelin güvenli, deyimsel bir yeniden yapılandırmayla `unsafe` olmadan çevrildiğini göstermiştir (pthread tabanlı paylaşılan bellek eşzamanlılığı örneği de benzer biçimde, `Arc&lt;Mutex&lt;&gt;&gt;` deseniyle güvenli ve ilk seferde doğru çevrilmiştir). Son olarak, başarısız on yedi örneğe derleyici/çalışma zamanı hata mesajları geri bildirim olarak verilip düzeltme istendiğinde (Round 2), yürütme doğruluğu %100'e ulaşmıştır — ve bunun bir üst sınır olduğu, aynı örnekler üzerinde ölçülen daha kısıtlı geri bildirim koşullarında doğruluğun %86.0'a ve %71.9'a düşmesiyle doğrudan kanıtlanmıştır. Bulgular, LLM kod çevirisinde asıl riskin sözdizimsel hatalar değil sessiz semantik/mantık hataları olduğunu ve doğrulama-geri bildirim döngülerinin bu riski etkili biçimde azalttığını göstermektedir. %100 doğruluk rakamının, ham çeviri performansını değil iyileştirme sürecinin etkinliğini yansıttığı özellikle vurgulanmalıdır.</w:t>
+        <w:t>Büyük dil modelleri (LLM), eski (legacy) C kod tabanlarını bellek-güvenli dillere aktarmada giderek daha çok kullanılıyor; ancak bu çevirilerin davranışsal eşdeğerliği — özellikle sözdizimsel olarak doğru göründüğü hâlde çalışma zamanında sessizce sapan çeviriler — yeterince incelenmemiştir. Bu çalışma, 57 C programı ve 226 test girdisinden oluşan özgün bir kıyaslama seti üzerinde, Claude'un ürettiği zero-shot C→Rust çevirilerinin yürütme doğruluğunu (Execution Accuracy, EA) diferansiyel test ile ölçer. Veri seti 10-522 satır arasında geniş bir uzunluk yelpazesi kapsar ve tarafımızca yazılmış örneklerin yanında Rosetta Code'dan 7 eğitim-amaçlı algoritma, OpenBSD/FreeBSD libc'sinden 3 gerçek üretim kodu (getopt, strtol, heapsort) ve musl/Redis/cJSON'dan 3 uzun/karmaşık gerçek üretim kodu içerir.</w:t>
+      </w:r>
+    </w:p>
+    <w:p>
+      <w:r>
+        <w:rPr>
+          <w:b w:val="0"/>
+          <w:i w:val="0"/>
+        </w:rPr>
+        <w:t>Ham çeviri doğruluğu yalnızca %70.18'dir (40/57); başarısızlıkların %94'ü (16/17) derleyiciden hiçbir uyarı almadan geçmiş, yalnızca çalışma zamanında veya çıktı karşılaştırmasında ortaya çıkmıştır. Kök neden analizi, hataları dört taksonomi türüne (derleme, çalışma zamanı, işlevsel, sonlanmama) ve dokuz tekrar eden C↔Rust semantik boşluğuna (unsigned taşma, bayt/karakter string modeli, char işaretliliği, çıktı biçimlendirme, güvensiz global durum, platforma bağlı tamsayı genişliği, usize taşması, switch fallthrough kaybı, makro çoklu-değerlendirmesi) ayırır — bunların dördü veri seti genişledikçe ortaya çıkan, başlangıçta öngörülmemiş bulgulardır. Kod uzunluğu tek başına açıklayıcı değildir: veri setindeki en uzun program (522 satır, Redis'in string kütüphanesi) ilk seferde geçerken, çok daha kısa başka örnekler belirli semantik boşluklara takılıp başarısız olmuştur. Release modda (taşma kontrolü kapalı) derlemek EA'yı %73.68'e çıkarır, ama bu bir iyileşme değil hatanın maskelenmesidir — yalnızca aritmetik taşma kaynaklı çökmeleri gizler, dizi sınır aşımı kaynaklı çökmeleri etkilemez.</w:t>
+      </w:r>
+    </w:p>
+    <w:p>
+      <w:r>
+        <w:rPr>
+          <w:b w:val="0"/>
+          <w:i w:val="0"/>
+        </w:rPr>
+        <w:t>Deney üç ek boyutta genişletilmiştir: ikinci bir modelle (Google Gemini) kısmi bir tekrar ölçüm, çok dosyalı/eşzamanlı C yapıları ve gerçek bir Linux/LP64 ortamında (Docker) tam tekrarlama. Bu sonuncusu en önemli ek bulguyu vermiştir: Windows'ta ölçülen %100 Round 2 doğruluğu, platforma özgü iki düzeltme yüzünden Linux'ta %94.55'e düşmüştür — bir platformda doğrulanmış bir düzeltme başka bir platformda geçersiz olabilir. Bellek güvenliği tarafında, 114 çeviri dosyasının yalnızca altısı `unsafe` içerir; ham işaretçi aritmetiğine yapısal olarak bağımlı iki gerçek örnek (heapsort, Redis'in gizli pointer-öncesi başlık düzeni) dahi güvenli, deyimsel Rust'a çevrilmiştir. Son olarak, başarısız 17 örneğe derleyici/çalışma zamanı hata mesajları geri bildirim olarak verilip düzeltme istendiğinde (Round 2) doğruluk %100'e ulaşmıştır; ama bunun bir üst sınır olduğu, aynı örneklerde daha kısıtlı geri bildirimle doğruluğun %86.0'a ve %71.9'a düşmesiyle doğrudan kanıtlanmıştır.</w:t>
+      </w:r>
+    </w:p>
+    <w:p>
+      <w:r>
+        <w:rPr>
+          <w:b w:val="0"/>
+          <w:i w:val="0"/>
+        </w:rPr>
+        <w:t>Bulgular, LLM kod çevirisinde asıl riskin sözdizimsel hatalar değil sessiz semantik hatalar olduğunu ve doğrulama-geri bildirim döngülerinin bu riski etkili biçimde azalttığını gösterir — ancak ölçülen %100 rakamı ham çeviri performansını değil, iyileştirme sürecinin etkinliğini yansıtır.</w:t>
       </w:r>
     </w:p>
     <w:p>
@@ -164,7 +191,7 @@
           <w:b w:val="0"/>
           <w:i w:val="0"/>
         </w:rPr>
-        <w:t>Bu soruları yanıtlamak için, 57 C programı ve 229 test girdisinden oluşan özgün, tekrarlanabilir bir kıyaslama seti ("C→Rust Legacy Çeviri Benchmark'ı") oluşturulmuş; her programın Claude tarafından üretilen Rust çevirisi, kaynak C programına karşı diferansiyel test ile doğrulanmıştır. Katkılarımız şu şekilde özetlenebilir: (i) klasik algoritmalar ile C→Rust arasındaki bilinen semantik boşlukları (tamsayı taşması, string modeli, işaretlilik, biçimlendirme, global durum) hedefleyen özgün bir veri seti; (ii) derleme modunun (debug/release) ölçülen doğruluğu nasıl gizleyebileceğinin deneysel kanıtı; (iii) dokuz kök nedene dayanan bir hata taksonomisi; (iv) hata geri bildirimine dayalı bir iyileştirme döngüsünün etkinliğinin, üç farklı geri bildirim ayrıntı seviyesinde ölçülmüş nicel gösterimi; (v) 10-522 satır arasında geniş bir kod uzunluğu yelpazesi üzerinde kontrollü bir karşılaştırma yoluyla, çeviri başarısının kod uzunluğundan çok hedeflenen semantik boşluğa bağlı olduğuna dair ek deneysel kanıt (dahası, veri setindeki en uzun program PASS olurken, ondan çok daha kısa başka bir gerçek üretim kodu örneği başka bir semantik boşluğa takılarak başarısız olmuştur); ve (vi) Rosetta Code'dan alınan 7 eğitim-amaçlı, OpenBSD/FreeBSD libc'sinden alınan 3 gerçek üretim (production) legacy kodu ve musl libc/Redis/cJSON'dan alınan 3 çok daha uzun/karmaşık gerçek üretim kodu olmak üzere toplam 13 bağımsız, gerçek dünya algoritması üzerinde tekrarlanan ölçümle, bulguların veri setinin kendi tasarımına özgü olmadığının — ve gerçek üretim kodunun kendine özgü, önceden öngörülmemiş yeni hata modları (platforma bağlı tamsayı genişliği; bağımsız bir kod tabanında tekrar eden %g biçimlendirme boşluğu) ortaya çıkarabileceğinin — gösterimi.</w:t>
+        <w:t>Bu soruları yanıtlamak için, 57 C programı ve 229 test girdisinden oluşan özgün, tekrarlanabilir bir kıyaslama seti ("C→Rust Legacy Çeviri Benchmark'ı") oluşturulmuş; her programın Claude tarafından üretilen Rust çevirisi, kaynak C programına karşı diferansiyel test ile doğrulanmıştır. Katkılarımız: (i) bilinen C↔Rust semantik boşluklarını (tamsayı taşması, string modeli, işaretlilik, biçimlendirme, global durum) hedefleyen özgün bir veri seti; (ii) derleme modunun (debug/release) ölçülen doğruluğu nasıl gizleyebileceğinin deneysel kanıtı; (iii) dokuz kök nedene dayanan bir hata taksonomisi; (iv) hata geri bildirimine dayalı bir iyileştirme döngüsünün etkinliğinin, üç farklı geri bildirim ayrıntı seviyesinde ölçülmüş nicel gösterimi; (v) 10-522 satır arasında geniş bir kod uzunluğu yelpazesinde, çeviri başarısının uzunluktan çok hedeflenen semantik boşluğa bağlı olduğuna dair kanıt (en uzun program PASS olurken çok daha kısa bazı örnekler başarısız olmuştur); ve (vi) Rosetta Code (7), OpenBSD/FreeBSD libc (3) ve musl/Redis/cJSON (3) olmak üzere 13 bağımsız gerçek dünya algoritması üzerinde tekrarlanan ölçümle, bulguların veri setinin kendi tasarımına özgü olmadığının ve gerçek üretim kodunun kendine özgü, önceden öngörülmemiş hata modları (platforma bağlı tamsayı genişliği; tekrar eden %g biçimlendirme boşluğu) çıkarabileceğinin gösterimi.</w:t>
       </w:r>
     </w:p>
     <w:p>
@@ -3825,7 +3852,7 @@
           <w:b w:val="0"/>
           <w:i w:val="0"/>
         </w:rPr>
-        <w:t>Bu ilişkiyi yalnızca birkaç uzun örnekle değerlendirmenin zayıf bir kanıt olacağı değerlendirilerek, orijinal 24 programlık veri setine (en uzunu 88 satır) önce 69-141 satır arasında 5 yeni, yapısal olarak daha karmaşık program (s25-s29), ardından 27-71 satır arasında 7 Rosetta Code örneği (s30-s36) ve son olarak 148-154 satır arasında 3 gerçek üretim kodu örneği (s37-s39, bkz. §3.1) ve son olarak 21-43 satır arasında 6 yeni hedefli program (s40-s45, bkz. §3.1) eklenmiştir. Şekil 4, tüm 57 örneğin kaynak kod uzunluğunu (LoC, C) başarı/başarısızlık durumuna göre göstermektedir. Betimsel eğilim büyük ölçüde önceki gözlemi doğrulamaktadır: eklenen 5 uzun programın dördü (69, 80, 87 ve 141 satır) ve 7 Rosetta Code örneğinin tamamı sorunsuz geçmiştir; başarısızlıkların büyük çoğunluğu (10/12) 10-73 satır aralığında kalmıştır. Ancak veri setine eklenen 6 gerçek üretim kodu örneği (s37-s39, s46-s48) bu tabloya önemli bir nüans katmıştır: bunlardan dördü (s37_bsd_getopt, 148 satır; s39_bsd_heapsort, 143 satır; s46_musl_qsort, 262 satır; s47_redis_sds, 522 satır) sorunsuz geçmiş, ikisi (s38_bsd_strtol, 154 satır; s48_cjson_number, 389 satır) başarısız olmuştur. s47_redis_sds, veri setindeki 57 programın tümü arasında en uzun olanıdır ve buna rağmen ilk seferde sorunsuz geçmiştir; bu, önceki turda geçersizleşen "en uzun program sorunsuz geçer" gözlemini bir bakıma yeniden doğrular gibi görünse de, aynı anda 389 satırlık s48'in başarısız olması, tek yönlü bir "uzunluk → başarı" ilişkisinin var olmadığını göstermektedir. Başarısızlıkların ikisi de (§4.4.F, §4.4.D) yine uzunlukla değil belirli semantik boşluklarla (platforma bağlı tamsayı genişliği; `%g` biçimlendirmesi) ilişkilidir — yani veri setindeki en uzun ve en kısa programların da PASS ya da FAIL olabilmesi, "uzun programlar karmaşıklıkları nedeniyle başarısız olur" savını değil, "başarısızlık uzunluktan bağımsız, hedeflenen semantik boşluğa bağlıdır" savını desteklemektedir.</w:t>
+        <w:t>Bu ilişkiyi yalnızca birkaç uzun örnekle değerlendirmenin zayıf bir kanıt olacağı değerlendirilerek, orijinal 24 programlık veri setine (en uzunu 88 satır) önce 69-141 satır arasında 5 yeni, yapısal olarak daha karmaşık program (s25-s29), ardından 27-71 satır arasında 7 Rosetta Code örneği (s30-s36) ve son olarak 148-154 satır arasında 3 gerçek üretim kodu örneği (s37-s39, bkz. §3.1) ve son olarak 21-43 satır arasında 6 yeni hedefli program (s40-s45, bkz. §3.1) eklenmiştir. Şekil 4, tüm 57 örneğin kaynak kod uzunluğunu (LoC, C) başarı/başarısızlık durumuna göre göstermektedir. Betimsel eğilim büyük ölçüde önceki gözlemi doğrulamaktadır: eklenen 5 uzun programın dördü (69, 80, 87 ve 141 satır) ve 7 Rosetta Code örneğinin tamamı sorunsuz geçmiştir; başarısızlıkların büyük çoğunluğu (10/12) 10-73 satır aralığında kalmıştır. Ancak veri setine eklenen 6 gerçek üretim kodu örneği (s37-s39, s46-s48) bu tabloya önemli bir nüans katmıştır: bunlardan dördü (s37_bsd_getopt, 148 satır; s39_bsd_heapsort, 143 satır; s46_musl_qsort, 262 satır; s47_redis_sds, 522 satır) sorunsuz geçmiş, ikisi (s38_bsd_strtol, 154 satır; s48_cjson_number, 389 satır) başarısız olmuştur. s47_redis_sds, veri setindeki 57 programın tümü arasında en uzun olanıdır ve buna rağmen ilk seferde sorunsuz geçmiştir; ancak aynı anda 389 satırlık s48'in başarısız olması, tek yönlü bir "uzunluk → başarı" ilişkisinin var olmadığını gösterir. Başarısızlıkların ikisi de (§4.4.F, §4.4.D) uzunlukla değil belirli semantik boşluklarla (platforma bağlı tamsayı genişliği; `%g` biçimlendirmesi) ilişkilidir — başarısızlık uzunluktan bağımsız, hedeflenen semantik boşluğa bağlıdır.</w:t>
       </w:r>
     </w:p>
     <w:p>
@@ -3834,7 +3861,7 @@
           <w:b w:val="0"/>
           <w:i w:val="0"/>
         </w:rPr>
-        <w:t>Bu betimsel gözlemin istatistiksel olarak da sınanması amacıyla, PASS (n=36) ve FAIL (n=12) gruplarının kaynak kod uzunluğu (LoC) dağılımları Mann-Whitney U testi ile karşılaştırılmıştır (parametrik olmayan bir test tercih edilmiştir, çünkü LoC dağılımının normal olduğu varsayılamaz ve n küçüktür). PASS grubunun ortanca LoC değeri 31.5 (ortalama 65.9), FAIL grubunun ortanca LoC değeri 20.0'dır (ortalama 66.3 — iki grubun ortalaması, uzun gerçek üretim kodu örneklerinin her iki gruba da dağılmasından ötürü artık neredeyse birbirine eşittir). Fark istatistiksel olarak anlamlı değildir (U=287.0, p=0.359, α=0.05 eşiğinde anlamlı değil) — veri seti 36→39→45→48→53→57 örneğe büyüdükçe p-değeri sırasıyla 0.076 → 0.187 → 0.169 → 0.273 → 0.337 → 0.359 olarak dalgalanmıştır; bu dalgalanmanın kendisi, küçük örneklemlerde p-değerinin istikrarsızlığına dair veriye dayalı bir gösterge sayılabilir. Bu, "kod uzunluğu başarıyı etkilemez" gibi kesin bir nedensel iddiada bulunmak yerine, daha temkinli bir ifadeyle: bu veri setinde kod uzunluğu ile çeviri başarısı arasında istatistiksel olarak anlamlı bir ilişki gözlenmemiştir ve veri seti büyüdükçe bu ilişkinin betimsel yönü dahi istikrarlı kalmamıştır. Bu, literatürdeki "kod uzunluğu arttıkça çeviri hatası artar" (FLUORINE) savını bu özel veri setinde doğrulamayan, ancak küçük örneklem (n=57, FAIL grubunda yalnızca 12 gözlem) nedeniyle kesin bir çürütme de sayılamayacak bir bulgudur (bkz. §6).</w:t>
+        <w:t>Bu betimsel gözlemin istatistiksel olarak da sınanması amacıyla, PASS (n=36) ve FAIL (n=12) gruplarının kaynak kod uzunluğu (LoC) dağılımları Mann-Whitney U testi ile karşılaştırılmıştır (parametrik olmayan bir test tercih edilmiştir, çünkü LoC dağılımının normal olduğu varsayılamaz ve n küçüktür). PASS grubunun ortanca LoC değeri 31.5 (ortalama 65.9), FAIL grubunun ortanca LoC değeri 20.0'dır (ortalama 66.3 — iki grubun ortalaması, uzun gerçek üretim kodu örneklerinin her iki gruba da dağılmasından ötürü artık neredeyse birbirine eşittir). Fark istatistiksel olarak anlamlı değildir (U=287.0, p=0.359, α=0.05 eşiğinde anlamlı değil) — veri seti 36→39→45→48→53→57 örneğe büyüdükçe p-değeri sırasıyla 0.076 → 0.187 → 0.169 → 0.273 → 0.337 → 0.359 olarak dalgalanmıştır — küçük örneklemlerde p-değerinin ne denli istikrarsız olabileceğinin veriye dayalı bir göstergesi. Temkinli sonuç: bu veri setinde kod uzunluğu ile çeviri başarısı arasında istatistiksel olarak anlamlı bir ilişki gözlenmemiştir. Bu, literatürdeki "kod uzunluğu arttıkça çeviri hatası artar" (FLUORINE) savını bu veri setinde doğrulamayan, ama küçük örneklem (FAIL grubunda yalnızca 12 gözlem) nedeniyle kesin bir çürütme de sayılamayacak bir bulgudur (bkz. §6).</w:t>
       </w:r>
     </w:p>
     <w:p>
@@ -5395,7 +5422,7 @@
           <w:b w:val="0"/>
           <w:i w:val="0"/>
         </w:rPr>
-        <w:t>Son olarak, iyileştirme döngüsünün EA'yı %70.18'den %100'e taşıması, hata geri bildirimine dayalı doğrulama-düzeltme döngülerinin (execution-guided refinement) pratik değerine dair olumlu bir işarettir. Ancak bu sonucun makalede ve pratikte nasıl sunulduğu kritik önem taşır: %100 rakamı, "insan/otomatik doğrulama olmadan model kusursuz çeviri yapar" biçiminde yanlış yorumlanmamalıdır; ayrıca bu rakam, modele derleyici hatası, panik metni ve beklenen-alınan farkını içeren zengin bir geri bildirim (oracle) sağlandığında elde edilen bir üst sınır performansıdır (§4.6). Bu değerlendirmeyi varsayımsal bırakmamak için ayrıca ölçülen iki kısıtlı geri bildirim koşulu (§4.6, Tablo 5), bu üst-sınır yorumunu doğrudan kanıtlarla desteklemektedir: geri bildirim ayrıntısı azaldıkça (oracle → orta → minimal) doğruluk %100'den %86.0'a, ardından %71.9'a düşmüştür — bu da Round 2'nin başarısının, sağlanan geri bildirimin zenginliğine doğrudan bağlı olduğunu göstermektedir. Doğru çerçeveleme şudur: ham çeviri doğruluğu %70.18 ile başlar; bu, doğrulama ve iteratif düzeltme mekanizmalarının LLM destekli kod çevirisi araç zincirlerinde isteğe bağlı bir eklenti değil, zorunlu bir bileşen olması gerektiğini göstermektedir. Son olarak, bu çalışmada yalnızca tek bir model (Claude Sonnet 5) test edilmiştir; bulgular bu modele özgüdür ve farklı modellerin (GPT, Gemini, DeepSeek vb.) hata profilleri niteliksel olarak farklılık gösterebilir. "LLM'ler kod çevirisinde şu şekilde davranır" türünden genellemeler yerine, bu çalışmanın bulguları "bu çalışmada test edilen model için" biçiminde okunmalıdır.</w:t>
+        <w:t>Son olarak, iyileştirme döngüsünün EA'yı %70.18'den %100'e taşıması, hata geri bildirimine dayalı doğrulama-düzeltme döngülerinin (execution-guided refinement) pratik değerine dair olumlu bir işarettir. Ancak bu sonucun makalede ve pratikte nasıl sunulduğu kritik önem taşır: %100 rakamı, "insan/otomatik doğrulama olmadan model kusursuz çeviri yapar" biçiminde yanlış yorumlanmamalıdır; ayrıca bu rakam, modele derleyici hatası, panik metni ve beklenen-alınan farkını içeren zengin bir geri bildirim (oracle) sağlandığında elde edilen bir üst sınır performansıdır (§4.6). Bu değerlendirmeyi varsayımsal bırakmamak için ayrıca ölçülen iki kısıtlı geri bildirim koşulu (§4.6, Tablo 5), bu üst-sınır yorumunu doğrudan kanıtlarla desteklemektedir: geri bildirim ayrıntısı azaldıkça (oracle → orta → minimal) doğruluk %100'den %86.0'a, ardından %71.9'a düşmüştür — bu da Round 2'nin başarısının, sağlanan geri bildirimin zenginliğine doğrudan bağlı olduğunu göstermektedir. Doğru çerçeveleme şudur: ham çeviri doğruluğu %70.18 ile başlar; bu, doğrulama ve iteratif düzeltme mekanizmalarının LLM destekli kod çevirisi araç zincirlerinde isteğe bağlı bir eklenti değil, zorunlu bir bileşen olması gerektiğini göstermektedir (tek-model sınırlaması ve çoklu-model doğrulaması için bkz. §6).</w:t>
       </w:r>
     </w:p>
     <w:p>
@@ -5510,7 +5537,7 @@
           <w:b w:val="0"/>
           <w:i w:val="0"/>
         </w:rPr>
-        <w:t>Bu çalışma, Claude Sonnet 5 modelinin ürettiği zero-shot C→Rust çevirilerinin yürütme doğruluğunu, özgün ve tekrarlanabilir 57 programlık bir kıyaslama setinde (10-522 satır; 7'si Rosetta Code'dan alınan eğitim amaçlı, 3'ü OpenBSD/FreeBSD libc'sinden, 3'ü musl libc/Redis/cJSON'dan alınan gerçek üretim kodu olmak üzere 13'ü tarafımızca yazılmamış bağımsız programlar, kalan 35'i ise bilinen veya sonradan keşfedilen C↔Rust boşluklarını hedefleyen özgün programlar) diferansiyel test yoluyla ölçmüştür. Ham çeviri doğruluğu %70.18 olarak ölçülmüş; başarısızlıkların büyük çoğunluğu (16/17) derleyiciden hiçbir uyarı almadan sessizce geçmiş ve yalnızca çalışma zamanında ya da çıktı karşılaştırmasında ortaya çıkmıştır. Kod uzunluğu etkisini özel olarak test etmek amacıyla eklenen daha uzun programların büyük çoğunluğu sorunsuz geçmiş; veri setindeki 57 programın tümü arasında en uzun olanı (522 satır, Redis'in dinamik string kütüphanesinden alınan çeviri) sorunsuz geçerken, çok daha kısa iki gerçek üretim kodu örneği (154 ve 389 satır) ayrı semantik boşluklardan (sırasıyla platforma bağlı tamsayı genişliği ve %g biçimlendirmesi) dolayı başarısız olmuştur; bu, "uzunluk değil hedeflenen boşluk belirleyicidir" savını doğrudan güçlendiren, veri setinin kendi tasarımından bağımsız bir bulgudur. Mann-Whitney U testi, PASS ve FAIL gruplarının kod uzunluğu arasında istatistiksel olarak anlamlı bir fark bulamamıştır (p=0.359), bu nedenle "kod uzunluğu önemli değildir" gibi kesin bir iddia yerine "bu veri setinde anlamlı bir ilişki gözlenmemiştir" biçiminde temkinli bir sonuç raporlanmaktadır. Bağımsız kaynaklı 13 algoritmanın (Luhn, Soundex, Levenshtein, sırt çantası, Hanoi kuleleri, en uzun ortak alt dizi, CRC-32, getopt, strtol, heapsort, smoothsort, SDS string kütüphanesi, cJSON sayı yazdırma) 11'inin ilk seferde geçmesi, bu bulgunun veri setinin kendi tasarımına özgü olmadığına dair ek kanıt sunar; iki başarısızlığın (strtol, cJSON) biri veri setinin özgün tasarımının hiç öngörmediği yeni bir kök neden, diğeri ise zaten bilinen bir kök nedenin bağımsız bir üçüncü doğrulamasını ortaya çıkarması, bu doğrulamanın suni biçimde kusursuz olmadığını, dolayısıyla daha inandırıcı olduğunu göstermektedir. Kök neden analizi, hataların dokuz tekrar eden C↔Rust semantik boşluğuna (unsigned taşma, string modeli, işaretlilik, biçimlendirme, global durum, tamsayı genişliği, işaretsiz-tip taşması, switch fallthrough, makro çoklu-değerlendirme) dayandığını göstermiştir; bunların dördü, veri seti kademeli olarak genişletildikçe ortaya çıkan, başlangıçta öngörülmemiş bulgulardır ve biri (biçimlendirme) tamamen bağımsız bir üçüncü kod tabanında (cJSON) da tekrarlanmıştır. Aynı ham çevirilerin release modunda %73.68'e çıkması — yalnızca aritmetik taşma kaynaklı hatalarda, diğer hata türlerinde değil — derleme yapılandırmasının doğruluk ölçümünü etkileyebilecek bir değişken olduğunu ortaya koymuştur; ayrıca gerçek bir Linux/LP64 ortamında (Docker) tekrarlanan aynı deney, Round 2'nin platforma özgü olabildiğini (Windows'ta %100, Linux'ta %94.55) doğrudan kanıtlamıştır. Bellek güvenliği analizi, 114 çeviri dosyasının yalnızca altısında (`unsafe` kullanımının C kodunun dışa açık veya kalıcı durum sözleşmesi ya da generic void* imzası tarafından yapısal olarak dayatıldığı `getopt()`, fonksiyon-lokal `static` önbellekleme ve `smoothsort` çevirileri) `unsafe` kullanıldığını, buna karşılık ham işaretçi aritmetiğine benzer biçimde bağımlı iki başka gerçek örneğin (`heapsort()` ve özellikle veri setindeki en karmaşık bellek-düzeni örneği olan Redis'in SDS string kütüphanesi) güvenli, deyimsel bir yeniden yapılandırmayla çevrildiğini göstermiştir. Son olarak, hata geri bildirimine dayalı bir iyileştirme döngüsü uygulandığında (Round 2) doğruluk %100'e ulaşmıştır — ancak bu rakam ham çeviri performansını değil, zengin bir hata-geri-bildirimi (oracle) altında elde edilen bir üst sınır performansını ve doğrulama-düzeltme döngüsünün etkinliğini yansıtmaktadır; nitekim veri setinin güncel veri setindeki aynı 17 örnek üzerinde ölçülen iki daha kısıtlı geri bildirim koşulu, doğruluğun sırasıyla %86.0 ve %71.9'a düştüğünü göstererek bu üst-sınır yorumunu doğrudan kanıtla desteklemektedir (§4.6, Tablo 5). Bu çalışmada yalnızca tek bir model test edilmiştir; bulgular Claude Sonnet 5'e özgüdür ve farklı modellere genellenmeden önce doğrulanmalıdır.</w:t>
+        <w:t>Bu çalışma, Claude Sonnet 5'in ürettiği zero-shot C→Rust çevirilerinin yürütme doğruluğunu, 57 programlık özgün ve tekrarlanabilir bir kıyaslama setinde (13'ü tarafımızca yazılmamış bağımsız gerçek dünya kodu) diferansiyel test ile ölçmüştür. Ham çeviri doğruluğu %70.18'de kalmış; başarısızlıkların büyük çoğunluğu (16/17) derleyiciden hiç uyarı almadan sessizce geçmiş, yalnızca çalışma zamanında ya da çıktı karşılaştırmasında ortaya çıkmıştır (§4.2). Kod uzunluğu tek başına belirleyici değildir — veri setindeki en uzun program (522 satır) sorunsuz geçerken çok daha kısa iki gerçek üretim kodu örneği farklı semantik boşluklara takılıp başarısız olmuştur, ve Mann-Whitney U testi PASS/FAIL grupları arasında anlamlı bir uzunluk farkı bulamamıştır (p=0.359, §4.3). Kök neden analizi hataları dokuz tekrar eden C↔Rust semantik boşluğuna ayırmıştır (§4.4); derleme yapılandırması (debug/release) ve platform (Windows/Linux) ölçülen doğruluğu değiştirebilen değişkenler olarak doğrulanmıştır (§4.5, §4.7). Bellek güvenliği tarafında, 114 çeviri dosyasının yalnızca altısı `unsafe` içermiştir (§4.8); ham işaretçi aritmetiğine bağımlı gerçek örnekler bile güvenli, deyimsel Rust'a çevrilmiştir. Hata geri bildirimine dayalı bir iyileştirme döngüsü (Round 2) doğruluğu %100'e taşımıştır, ama bu rakam zengin bir geri bildirim (oracle) altında elde edilen bir üst sınırdır — aynı örneklerde daha kısıtlı geri bildirim koşulları doğruluğu %86.0'a ve %71.9'a düşürmüştür (§4.6). Bu çalışmada tek bir model test edilmiştir; bulgular Claude Sonnet 5'e özgüdür ve farklı modellere genellenmeden önce doğrulanmalıdır (§6).</w:t>
       </w:r>
     </w:p>
     <w:p>
@@ -5519,7 +5546,7 @@
           <w:b w:val="0"/>
           <w:i w:val="0"/>
         </w:rPr>
-        <w:t>Bulgular, pratik açıdan şu öneriyi doğurmaktadır: LLM destekli kod çevirisi projelerinde, yalnızca derleme başarısına dayanan kabul kriterleri yetersizdir; diferansiyel test veya eşdeğer bir yürütme tabanlı doğrulama adımı ile, en az bir geri bildirim-düzeltme turu içeren bir süreç zorunlu tutulmalıdır. Gelecek çalışmalar, veri setini daha büyük, çok dosyalı ve gerçekten endüstriyel legacy kod tabanlarına (bu çalışmadaki 6 tek/az-fonksiyonlu gerçek üretim kodu örneğinin ötesinde) genişletmeyi, birden fazla modeli (GPT, Gemini, DeepSeek vb.) istatistiksel olarak yeterli örneklem büyüklüğüyle karşılaştırmayı, kod uzunluğu-başarı ilişkisini daha büyük n ile yeniden test etmeyi, farklı platformlarda (özellikle Linux/LP64) aynı deneyi tekrarlayarak platform-bağımlı bulguların (§4.4.F) genelliğini sınamayı ve çok turlu iyileştirme döngülerinin (daha kısıtlı, gerçekçi geri bildirim koşullarında) yakınsama davranışını incelemeyi hedefleyebilir.</w:t>
+        <w:t>Bulgular, pratik açıdan şu öneriyi doğurmaktadır: LLM destekli kod çevirisi projelerinde yalnızca derleme başarısına dayanan kabul kriterleri yetersizdir; diferansiyel test veya eşdeğer bir yürütme tabanlı doğrulama adımı, en az bir geri bildirim-düzeltme turu ile birlikte zorunlu tutulmalıdır. Gelecek çalışmalar, veri setini daha büyük ve gerçekten endüstriyel legacy kod tabanlarına genişletmeyi, çoklu-model karşılaştırmasını istatistiksel olarak yeterli örneklemle tamamlamayı (bu çalışmada Gemini ile başlatılan kısmi doğrulamanın ötesinde, GPT/DeepSeek dahil), kod uzunluğu-başarı ilişkisini daha büyük n ile yeniden test etmeyi ve çok turlu iyileştirme döngülerinin daha kısıtlı, gerçekçi geri bildirim koşullarında yakınsama davranışını incelemeyi hedefleyebilir.</w:t>
       </w:r>
     </w:p>
     <w:p>

</xml_diff>